<commit_message>
Correction data leakage : validation temporelle (cutoff 30/09/2024)
</commit_message>
<xml_diff>
--- a/rapport/parties/Câline_M6.docx
+++ b/rapport/parties/Câline_M6.docx
@@ -6,26 +6,34 @@
       <w:pPr>
         <w:pStyle w:val="Heading1"/>
         <w:rPr>
-          <w:color w:val="000000" w:themeColor="text1"/>
-        </w:rPr>
-      </w:pPr>
-      <w:r>
-        <w:rPr>
-          <w:color w:val="000000" w:themeColor="text1"/>
+          <w:color w:val="auto"/>
+          <w:sz w:val="36"/>
+          <w:szCs w:val="36"/>
+        </w:rPr>
+      </w:pPr>
+      <w:r>
+        <w:rPr>
+          <w:color w:val="auto"/>
+          <w:sz w:val="36"/>
+          <w:szCs w:val="36"/>
         </w:rPr>
         <w:t xml:space="preserve">M6 — Prédiction du </w:t>
       </w:r>
       <w:proofErr w:type="spellStart"/>
       <w:r>
         <w:rPr>
-          <w:color w:val="000000" w:themeColor="text1"/>
+          <w:color w:val="auto"/>
+          <w:sz w:val="36"/>
+          <w:szCs w:val="36"/>
         </w:rPr>
         <w:t>churn</w:t>
       </w:r>
       <w:proofErr w:type="spellEnd"/>
       <w:r>
         <w:rPr>
-          <w:color w:val="000000" w:themeColor="text1"/>
+          <w:color w:val="auto"/>
+          <w:sz w:val="36"/>
+          <w:szCs w:val="36"/>
         </w:rPr>
         <w:t xml:space="preserve"> et de la valeur client (CLV)</w:t>
       </w:r>
@@ -47,7 +55,7 @@
           <w:sz w:val="22"/>
           <w:szCs w:val="22"/>
         </w:rPr>
-        <w:t xml:space="preserve"> OCC, N°4610,</w:t>
+        <w:t xml:space="preserve"> OCC, N°4610, ENI,</w:t>
       </w:r>
       <w:r>
         <w:rPr>
@@ -64,7 +72,7 @@
       <w:pPr>
         <w:pStyle w:val="Heading2"/>
         <w:rPr>
-          <w:color w:val="000000" w:themeColor="text1"/>
+          <w:color w:val="auto"/>
           <w:sz w:val="28"/>
           <w:szCs w:val="28"/>
           <w:u w:val="single"/>
@@ -72,7 +80,7 @@
       </w:pPr>
       <w:r>
         <w:rPr>
-          <w:color w:val="000000" w:themeColor="text1"/>
+          <w:color w:val="auto"/>
           <w:sz w:val="28"/>
           <w:szCs w:val="28"/>
           <w:u w:val="single"/>
@@ -108,7 +116,7 @@
           <w:sz w:val="24"/>
           <w:szCs w:val="24"/>
         </w:rPr>
-        <w:t xml:space="preserve">), et quelle est la valeur estimée de chaque client pour l'entreprise (Customer </w:t>
+        <w:t xml:space="preserve">), et quelle est la valeur estimée de chaque client (CLV). Ces résultats alimentent la stratégie marketing par segment (M7, Lalatiana) et le </w:t>
       </w:r>
       <w:proofErr w:type="spellStart"/>
       <w:r>
@@ -116,7 +124,7 @@
           <w:sz w:val="24"/>
           <w:szCs w:val="24"/>
         </w:rPr>
-        <w:t>Lifetime</w:t>
+        <w:t>dashboard</w:t>
       </w:r>
       <w:proofErr w:type="spellEnd"/>
       <w:r>
@@ -124,7 +132,7 @@
           <w:sz w:val="24"/>
           <w:szCs w:val="24"/>
         </w:rPr>
-        <w:t xml:space="preserve"> Value, CLV). Ces résultats alimentent la définition de la stratégie marketing par segment (M7, Lalatiana) et le </w:t>
+        <w:t xml:space="preserve"> (M8, </w:t>
       </w:r>
       <w:proofErr w:type="spellStart"/>
       <w:r>
@@ -132,7 +140,7 @@
           <w:sz w:val="24"/>
           <w:szCs w:val="24"/>
         </w:rPr>
-        <w:t>dashboard</w:t>
+        <w:t>Toky</w:t>
       </w:r>
       <w:proofErr w:type="spellEnd"/>
       <w:r>
@@ -140,22 +148,6 @@
           <w:sz w:val="24"/>
           <w:szCs w:val="24"/>
         </w:rPr>
-        <w:t xml:space="preserve"> (M8, </w:t>
-      </w:r>
-      <w:proofErr w:type="spellStart"/>
-      <w:r>
-        <w:rPr>
-          <w:sz w:val="24"/>
-          <w:szCs w:val="24"/>
-        </w:rPr>
-        <w:t>Toky</w:t>
-      </w:r>
-      <w:proofErr w:type="spellEnd"/>
-      <w:r>
-        <w:rPr>
-          <w:sz w:val="24"/>
-          <w:szCs w:val="24"/>
-        </w:rPr>
         <w:t>).</w:t>
       </w:r>
     </w:p>
@@ -164,7 +156,7 @@
       <w:pPr>
         <w:pStyle w:val="Heading2"/>
         <w:rPr>
-          <w:color w:val="000000" w:themeColor="text1"/>
+          <w:color w:val="auto"/>
           <w:sz w:val="28"/>
           <w:szCs w:val="28"/>
           <w:u w:val="single"/>
@@ -172,7 +164,7 @@
       </w:pPr>
       <w:r>
         <w:rPr>
-          <w:color w:val="000000" w:themeColor="text1"/>
+          <w:color w:val="auto"/>
           <w:sz w:val="28"/>
           <w:szCs w:val="28"/>
           <w:u w:val="single"/>
@@ -192,7 +184,7 @@
           <w:sz w:val="24"/>
           <w:szCs w:val="24"/>
         </w:rPr>
-        <w:t>Le fichier clients_agreges.csv (data/</w:t>
+        <w:t>Le fichier ventes_fusionnees.csv (data/</w:t>
       </w:r>
       <w:proofErr w:type="spellStart"/>
       <w:r>
@@ -208,87 +200,7 @@
           <w:sz w:val="24"/>
           <w:szCs w:val="24"/>
         </w:rPr>
-        <w:t xml:space="preserve">/), préparé par </w:t>
-      </w:r>
-      <w:proofErr w:type="spellStart"/>
-      <w:r>
-        <w:rPr>
-          <w:sz w:val="24"/>
-          <w:szCs w:val="24"/>
-        </w:rPr>
-        <w:t>Toky</w:t>
-      </w:r>
-      <w:proofErr w:type="spellEnd"/>
-      <w:r>
-        <w:rPr>
-          <w:sz w:val="24"/>
-          <w:szCs w:val="24"/>
-        </w:rPr>
-        <w:t xml:space="preserve"> (M2), fournit 805 clients avec les indicateurs RFM déjà calculés (</w:t>
-      </w:r>
-      <w:proofErr w:type="spellStart"/>
-      <w:r>
-        <w:rPr>
-          <w:sz w:val="24"/>
-          <w:szCs w:val="24"/>
-        </w:rPr>
-        <w:t>Nb_Achats</w:t>
-      </w:r>
-      <w:proofErr w:type="spellEnd"/>
-      <w:r>
-        <w:rPr>
-          <w:sz w:val="24"/>
-          <w:szCs w:val="24"/>
-        </w:rPr>
-        <w:t xml:space="preserve">, </w:t>
-      </w:r>
-      <w:proofErr w:type="spellStart"/>
-      <w:r>
-        <w:rPr>
-          <w:sz w:val="24"/>
-          <w:szCs w:val="24"/>
-        </w:rPr>
-        <w:t>Montant_Total</w:t>
-      </w:r>
-      <w:proofErr w:type="spellEnd"/>
-      <w:r>
-        <w:rPr>
-          <w:sz w:val="24"/>
-          <w:szCs w:val="24"/>
-        </w:rPr>
-        <w:t xml:space="preserve">, </w:t>
-      </w:r>
-      <w:proofErr w:type="spellStart"/>
-      <w:r>
-        <w:rPr>
-          <w:sz w:val="24"/>
-          <w:szCs w:val="24"/>
-        </w:rPr>
-        <w:t>Panier_Moyen</w:t>
-      </w:r>
-      <w:proofErr w:type="spellEnd"/>
-      <w:r>
-        <w:rPr>
-          <w:sz w:val="24"/>
-          <w:szCs w:val="24"/>
-        </w:rPr>
-        <w:t xml:space="preserve">, </w:t>
-      </w:r>
-      <w:proofErr w:type="spellStart"/>
-      <w:r>
-        <w:rPr>
-          <w:sz w:val="24"/>
-          <w:szCs w:val="24"/>
-        </w:rPr>
-        <w:t>Recence_Jours</w:t>
-      </w:r>
-      <w:proofErr w:type="spellEnd"/>
-      <w:r>
-        <w:rPr>
-          <w:sz w:val="24"/>
-          <w:szCs w:val="24"/>
-        </w:rPr>
-        <w:t>). Ce jeu de données étend les 5 clients d'origine du professeur à 805 clients, dont 79 n'ayant jamais acheté (voir docs/regles_donnees.md).</w:t>
+        <w:t>/) fournit 5337 ventes réalisées entre le 2023-01-01 et le 2024-12-31, avec les informations du client et du produit pour chaque vente. Contrairement à clients_agreges.csv (agrégé sur toute la période), ce fichier permet de recalculer les indicateurs à n'importe quelle date de référence — nécessaire pour la méthode retenue (section 3.1).</w:t>
       </w:r>
     </w:p>
     <w:p/>
@@ -296,7 +208,7 @@
       <w:pPr>
         <w:pStyle w:val="Heading2"/>
         <w:rPr>
-          <w:color w:val="000000" w:themeColor="text1"/>
+          <w:color w:val="auto"/>
           <w:sz w:val="28"/>
           <w:szCs w:val="28"/>
           <w:u w:val="single"/>
@@ -304,7 +216,7 @@
       </w:pPr>
       <w:r>
         <w:rPr>
-          <w:color w:val="000000" w:themeColor="text1"/>
+          <w:color w:val="auto"/>
           <w:sz w:val="28"/>
           <w:szCs w:val="28"/>
           <w:u w:val="single"/>
@@ -316,173 +228,273 @@
       <w:pPr>
         <w:pStyle w:val="Heading3"/>
         <w:rPr>
-          <w:color w:val="000000" w:themeColor="text1"/>
+          <w:color w:val="auto"/>
           <w:sz w:val="26"/>
           <w:szCs w:val="26"/>
         </w:rPr>
       </w:pPr>
       <w:r>
         <w:rPr>
-          <w:color w:val="000000" w:themeColor="text1"/>
+          <w:color w:val="auto"/>
           <w:sz w:val="26"/>
           <w:szCs w:val="26"/>
         </w:rPr>
-        <w:t xml:space="preserve">3.1 Définition du </w:t>
+        <w:t xml:space="preserve">3.1 Éviter la fuite de données (data </w:t>
       </w:r>
       <w:proofErr w:type="spellStart"/>
       <w:r>
         <w:rPr>
-          <w:color w:val="000000" w:themeColor="text1"/>
+          <w:color w:val="auto"/>
           <w:sz w:val="26"/>
           <w:szCs w:val="26"/>
         </w:rPr>
-        <w:t>churn</w:t>
+        <w:t>leakage</w:t>
       </w:r>
       <w:proofErr w:type="spellEnd"/>
-    </w:p>
-    <w:p>
-      <w:pPr>
-        <w:rPr>
-          <w:sz w:val="24"/>
-          <w:szCs w:val="24"/>
-        </w:rPr>
-      </w:pPr>
-      <w:r>
-        <w:rPr>
-          <w:sz w:val="24"/>
-          <w:szCs w:val="24"/>
-        </w:rPr>
-        <w:t xml:space="preserve">Un client est considéré comme </w:t>
-      </w:r>
-      <w:proofErr w:type="spellStart"/>
-      <w:r>
-        <w:rPr>
-          <w:sz w:val="24"/>
-          <w:szCs w:val="24"/>
-        </w:rPr>
-        <w:t>churné</w:t>
-      </w:r>
-      <w:proofErr w:type="spellEnd"/>
-      <w:r>
-        <w:rPr>
-          <w:sz w:val="24"/>
-          <w:szCs w:val="24"/>
-        </w:rPr>
-        <w:t xml:space="preserve"> s'il n'a effectué aucun achat depuis plus de 90 jours par rapport à la date de référence du jeu de données (2024-12-31, dernière vente enregistrée). Pour les 79 clients n'ayant jamais acheté, la récence est approximée par leur ancienneté depuis l'inscription (</w:t>
-      </w:r>
-      <w:proofErr w:type="spellStart"/>
-      <w:r>
-        <w:rPr>
-          <w:sz w:val="24"/>
-          <w:szCs w:val="24"/>
-        </w:rPr>
-        <w:t>Anciennete_Jours</w:t>
-      </w:r>
-      <w:proofErr w:type="spellEnd"/>
-      <w:r>
-        <w:rPr>
-          <w:sz w:val="24"/>
-          <w:szCs w:val="24"/>
-        </w:rPr>
-        <w:t>), en l'absence de date d'achat.</w:t>
-      </w:r>
-    </w:p>
-    <w:p>
-      <w:pPr>
-        <w:rPr>
-          <w:sz w:val="24"/>
-          <w:szCs w:val="24"/>
-        </w:rPr>
-      </w:pPr>
-    </w:p>
-    <w:p>
-      <w:pPr>
-        <w:pStyle w:val="Heading3"/>
-        <w:rPr>
-          <w:color w:val="000000" w:themeColor="text1"/>
+      <w:r>
+        <w:rPr>
+          <w:color w:val="auto"/>
           <w:sz w:val="26"/>
           <w:szCs w:val="26"/>
         </w:rPr>
-      </w:pPr>
-      <w:r>
-        <w:rPr>
-          <w:color w:val="000000" w:themeColor="text1"/>
+        <w:t>)</w:t>
+      </w:r>
+    </w:p>
+    <w:p>
+      <w:r>
+        <w:rPr>
+          <w:sz w:val="24"/>
+          <w:szCs w:val="24"/>
+        </w:rPr>
+        <w:t xml:space="preserve">Une première version de ce travail définissait le </w:t>
+      </w:r>
+      <w:proofErr w:type="spellStart"/>
+      <w:r>
+        <w:rPr>
+          <w:sz w:val="24"/>
+          <w:szCs w:val="24"/>
+        </w:rPr>
+        <w:t>churn</w:t>
+      </w:r>
+      <w:proofErr w:type="spellEnd"/>
+      <w:r>
+        <w:rPr>
+          <w:sz w:val="24"/>
+          <w:szCs w:val="24"/>
+        </w:rPr>
+        <w:t xml:space="preserve"> comme « aucun achat depuis plus de 90 jours » et utilisait la Récence comme variable prédictive. Cette approche crée une fuite de données (data </w:t>
+      </w:r>
+      <w:proofErr w:type="spellStart"/>
+      <w:r>
+        <w:rPr>
+          <w:sz w:val="24"/>
+          <w:szCs w:val="24"/>
+        </w:rPr>
+        <w:t>leakage</w:t>
+      </w:r>
+      <w:proofErr w:type="spellEnd"/>
+      <w:r>
+        <w:rPr>
+          <w:sz w:val="24"/>
+          <w:szCs w:val="24"/>
+        </w:rPr>
+        <w:t xml:space="preserve">) : la Récence détermine directement l'étiquette de </w:t>
+      </w:r>
+      <w:proofErr w:type="spellStart"/>
+      <w:r>
+        <w:rPr>
+          <w:sz w:val="24"/>
+          <w:szCs w:val="24"/>
+        </w:rPr>
+        <w:t>churn</w:t>
+      </w:r>
+      <w:proofErr w:type="spellEnd"/>
+      <w:r>
+        <w:rPr>
+          <w:sz w:val="24"/>
+          <w:szCs w:val="24"/>
+        </w:rPr>
+        <w:t>, si bien que le modèle atteint 100% de précision en se contentant de retrouver la règle, sans capacité de généralisation réelle. Ce problème a été identifié et corrigé avant la livraison finale</w:t>
+      </w:r>
+      <w:r>
+        <w:t>.</w:t>
+      </w:r>
+    </w:p>
+    <w:p/>
+    <w:p>
+      <w:pPr>
+        <w:pStyle w:val="Heading3"/>
+        <w:rPr>
+          <w:color w:val="auto"/>
           <w:sz w:val="26"/>
           <w:szCs w:val="26"/>
         </w:rPr>
-        <w:t>3.2 Estimation de la CLV</w:t>
-      </w:r>
-    </w:p>
-    <w:p>
-      <w:pPr>
-        <w:rPr>
-          <w:sz w:val="24"/>
-          <w:szCs w:val="24"/>
-        </w:rPr>
-      </w:pPr>
-      <w:r>
-        <w:rPr>
-          <w:sz w:val="24"/>
-          <w:szCs w:val="24"/>
-        </w:rPr>
-        <w:t xml:space="preserve">CLV = </w:t>
-      </w:r>
-      <w:proofErr w:type="spellStart"/>
-      <w:r>
-        <w:rPr>
-          <w:sz w:val="24"/>
-          <w:szCs w:val="24"/>
-        </w:rPr>
-        <w:t>Panier_Moyen</w:t>
-      </w:r>
-      <w:proofErr w:type="spellEnd"/>
-      <w:r>
-        <w:rPr>
-          <w:sz w:val="24"/>
-          <w:szCs w:val="24"/>
-        </w:rPr>
-        <w:t xml:space="preserve"> × fréquence d'achat mensuelle × durée de vie estimée (24 mois). La fréquence mensuelle est calculée sur la période complète couverte par les données (janvier 2023 à décembre 2024, soit environ 24 mois), pour refléter un rythme d'achat réaliste.</w:t>
-      </w:r>
-    </w:p>
-    <w:p>
-      <w:pPr>
-        <w:rPr>
-          <w:sz w:val="24"/>
-          <w:szCs w:val="24"/>
-        </w:rPr>
-      </w:pPr>
-    </w:p>
-    <w:p>
-      <w:pPr>
-        <w:pStyle w:val="Heading3"/>
-        <w:rPr>
-          <w:color w:val="000000" w:themeColor="text1"/>
+      </w:pPr>
+      <w:r>
+        <w:rPr>
+          <w:color w:val="auto"/>
           <w:sz w:val="26"/>
           <w:szCs w:val="26"/>
         </w:rPr>
-      </w:pPr>
-      <w:r>
-        <w:rPr>
-          <w:color w:val="000000" w:themeColor="text1"/>
+        <w:t>3.2 Méthode retenue : validation temporelle</w:t>
+      </w:r>
+    </w:p>
+    <w:p>
+      <w:pPr>
+        <w:rPr>
+          <w:sz w:val="24"/>
+          <w:szCs w:val="24"/>
+        </w:rPr>
+      </w:pPr>
+      <w:r>
+        <w:rPr>
+          <w:sz w:val="24"/>
+          <w:szCs w:val="24"/>
+        </w:rPr>
+        <w:t>L'historique des ventes est coupé au 30 septembre 2024 :</w:t>
+      </w:r>
+    </w:p>
+    <w:p>
+      <w:pPr>
+        <w:pStyle w:val="ListParagraph"/>
+        <w:numPr>
+          <w:ilvl w:val="0"/>
+          <w:numId w:val="1"/>
+        </w:numPr>
+        <w:rPr>
+          <w:sz w:val="24"/>
+          <w:szCs w:val="24"/>
+        </w:rPr>
+      </w:pPr>
+      <w:r>
+        <w:rPr>
+          <w:sz w:val="24"/>
+          <w:szCs w:val="24"/>
+        </w:rPr>
+        <w:t>Les variables (Récence, Fréquence, Montant, Âge, Part des achats en ligne) sont calculées uniquement à partir des ventes antérieures ou égales au 30 septembre 2024.</w:t>
+      </w:r>
+    </w:p>
+    <w:p>
+      <w:pPr>
+        <w:pStyle w:val="ListParagraph"/>
+        <w:numPr>
+          <w:ilvl w:val="0"/>
+          <w:numId w:val="1"/>
+        </w:numPr>
+        <w:rPr>
+          <w:sz w:val="24"/>
+          <w:szCs w:val="24"/>
+        </w:rPr>
+      </w:pPr>
+      <w:r>
+        <w:rPr>
+          <w:sz w:val="24"/>
+          <w:szCs w:val="24"/>
+        </w:rPr>
+        <w:t>La cible Churn = 1 si le client n'effectue aucun achat entre le 1er octobre et le 31 décembre 2024, 0 sinon.</w:t>
+      </w:r>
+    </w:p>
+    <w:p>
+      <w:pPr>
+        <w:pStyle w:val="ListParagraph"/>
+        <w:numPr>
+          <w:ilvl w:val="0"/>
+          <w:numId w:val="1"/>
+        </w:numPr>
+        <w:rPr>
+          <w:sz w:val="24"/>
+          <w:szCs w:val="24"/>
+        </w:rPr>
+      </w:pPr>
+      <w:r>
+        <w:rPr>
+          <w:sz w:val="24"/>
+          <w:szCs w:val="24"/>
+        </w:rPr>
+        <w:t>Seuls les clients ayant acheté au moins une fois avant la date de coupure sont conservés pour l'entraînement (709 clients). Les 79 clients n'ayant jamais acheté sont exclus, faute d'historique exploitable.</w:t>
+      </w:r>
+    </w:p>
+    <w:p>
+      <w:pPr>
+        <w:rPr>
+          <w:sz w:val="24"/>
+          <w:szCs w:val="24"/>
+        </w:rPr>
+      </w:pPr>
+      <w:r>
+        <w:rPr>
+          <w:sz w:val="24"/>
+          <w:szCs w:val="24"/>
+        </w:rPr>
+        <w:t>Le modèle ne connaît donc jamais la réponse au moment de faire sa prédiction — il doit anticiper un comportement futur à partir de signaux passés, ce qui correspond à un cas d'usage réel.</w:t>
+      </w:r>
+    </w:p>
+    <w:p/>
+    <w:p>
+      <w:pPr>
+        <w:pStyle w:val="Heading3"/>
+        <w:rPr>
+          <w:color w:val="auto"/>
           <w:sz w:val="26"/>
           <w:szCs w:val="26"/>
         </w:rPr>
-        <w:t>3.3 Modèles prédictifs</w:t>
-      </w:r>
-    </w:p>
-    <w:p>
-      <w:pPr>
-        <w:rPr>
-          <w:sz w:val="24"/>
-          <w:szCs w:val="24"/>
-        </w:rPr>
-      </w:pPr>
-      <w:r>
-        <w:rPr>
-          <w:sz w:val="24"/>
-          <w:szCs w:val="24"/>
-        </w:rPr>
-        <w:t xml:space="preserve">Trois modèles de classification ont été entraînés pour prédire le </w:t>
+      </w:pPr>
+      <w:r>
+        <w:rPr>
+          <w:color w:val="auto"/>
+          <w:sz w:val="26"/>
+          <w:szCs w:val="26"/>
+        </w:rPr>
+        <w:t>3.3 Estimation de la CLV</w:t>
+      </w:r>
+    </w:p>
+    <w:p>
+      <w:pPr>
+        <w:rPr>
+          <w:sz w:val="24"/>
+          <w:szCs w:val="24"/>
+        </w:rPr>
+      </w:pPr>
+      <w:r>
+        <w:rPr>
+          <w:sz w:val="24"/>
+          <w:szCs w:val="24"/>
+        </w:rPr>
+        <w:t>CLV = Panier moyen × fréquence d'achat mensuelle × durée de vie estimée (24 mois), calculée sur l'historique complet (2023-01-01 à 2024-12-31).</w:t>
+      </w:r>
+    </w:p>
+    <w:p/>
+    <w:p>
+      <w:pPr>
+        <w:pStyle w:val="Heading3"/>
+        <w:rPr>
+          <w:color w:val="auto"/>
+          <w:sz w:val="26"/>
+          <w:szCs w:val="26"/>
+        </w:rPr>
+      </w:pPr>
+      <w:r>
+        <w:rPr>
+          <w:color w:val="auto"/>
+          <w:sz w:val="26"/>
+          <w:szCs w:val="26"/>
+        </w:rPr>
+        <w:t>3.4 Modèles entraînés</w:t>
+      </w:r>
+    </w:p>
+    <w:p>
+      <w:pPr>
+        <w:rPr>
+          <w:sz w:val="24"/>
+          <w:szCs w:val="24"/>
+        </w:rPr>
+      </w:pPr>
+      <w:r>
+        <w:rPr>
+          <w:sz w:val="24"/>
+          <w:szCs w:val="24"/>
+        </w:rPr>
+        <w:t xml:space="preserve">Régression logistique, Random Forest (200 arbres, profondeur max. 6) et </w:t>
       </w:r>
       <w:proofErr w:type="spellStart"/>
       <w:r>
@@ -490,7 +502,7 @@
           <w:sz w:val="24"/>
           <w:szCs w:val="24"/>
         </w:rPr>
-        <w:t>churn</w:t>
+        <w:t>XGBoost</w:t>
       </w:r>
       <w:proofErr w:type="spellEnd"/>
       <w:r>
@@ -498,23 +510,7 @@
           <w:sz w:val="24"/>
           <w:szCs w:val="24"/>
         </w:rPr>
-        <w:t xml:space="preserve"> à partir de la Récence, du Nombre d'achats, du Montant total et de l'Âge : régression logistique, Random Forest (200 arbres) et </w:t>
-      </w:r>
-      <w:proofErr w:type="spellStart"/>
-      <w:r>
-        <w:rPr>
-          <w:sz w:val="24"/>
-          <w:szCs w:val="24"/>
-        </w:rPr>
-        <w:t>XGBoost</w:t>
-      </w:r>
-      <w:proofErr w:type="spellEnd"/>
-      <w:r>
-        <w:rPr>
-          <w:sz w:val="24"/>
-          <w:szCs w:val="24"/>
-        </w:rPr>
-        <w:t>, avec une séparation stratifiée 70% entraînement / 30% test.</w:t>
+        <w:t xml:space="preserve"> (profondeur max. 4), avec séparation stratifiée 70% entraînement / 30% test sur les 709 clients éligibles.</w:t>
       </w:r>
     </w:p>
     <w:p/>
@@ -522,7 +518,7 @@
       <w:pPr>
         <w:pStyle w:val="Heading2"/>
         <w:rPr>
-          <w:color w:val="000000" w:themeColor="text1"/>
+          <w:color w:val="auto"/>
           <w:sz w:val="28"/>
           <w:szCs w:val="28"/>
           <w:u w:val="single"/>
@@ -530,7 +526,7 @@
       </w:pPr>
       <w:r>
         <w:rPr>
-          <w:color w:val="000000" w:themeColor="text1"/>
+          <w:color w:val="auto"/>
           <w:sz w:val="28"/>
           <w:szCs w:val="28"/>
           <w:u w:val="single"/>
@@ -542,110 +538,66 @@
       <w:pPr>
         <w:pStyle w:val="Heading3"/>
         <w:rPr>
-          <w:color w:val="000000" w:themeColor="text1"/>
+          <w:color w:val="auto"/>
           <w:sz w:val="26"/>
           <w:szCs w:val="26"/>
         </w:rPr>
       </w:pPr>
       <w:r>
         <w:rPr>
-          <w:color w:val="000000" w:themeColor="text1"/>
+          <w:color w:val="auto"/>
           <w:sz w:val="26"/>
           <w:szCs w:val="26"/>
         </w:rPr>
-        <w:t>4.1 Répartition des clients</w:t>
-      </w:r>
-    </w:p>
-    <w:p>
-      <w:pPr>
-        <w:rPr>
-          <w:sz w:val="24"/>
-          <w:szCs w:val="24"/>
-        </w:rPr>
-      </w:pPr>
-      <w:r>
-        <w:rPr>
-          <w:sz w:val="24"/>
-          <w:szCs w:val="24"/>
-        </w:rPr>
-        <w:t xml:space="preserve">Sur 805 clients, 417 sont considérés comme </w:t>
+        <w:t xml:space="preserve">4.1 Répartition du </w:t>
       </w:r>
       <w:proofErr w:type="spellStart"/>
       <w:r>
         <w:rPr>
-          <w:sz w:val="24"/>
-          <w:szCs w:val="24"/>
-        </w:rPr>
-        <w:t>churnés</w:t>
-      </w:r>
-      <w:proofErr w:type="spellEnd"/>
-      <w:r>
-        <w:rPr>
-          <w:sz w:val="24"/>
-          <w:szCs w:val="24"/>
-        </w:rPr>
-        <w:t xml:space="preserve"> (51,8%) et 388 comme actifs (48,2%).</w:t>
-      </w:r>
-    </w:p>
-    <w:p>
-      <w:r>
-        <w:rPr>
-          <w:noProof/>
-        </w:rPr>
-        <w:lastRenderedPageBreak/>
-        <w:drawing>
-          <wp:inline distT="0" distB="0" distL="0" distR="0" wp14:anchorId="6B78A46A" wp14:editId="77508C60">
-            <wp:extent cx="4772025" cy="3544933"/>
-            <wp:effectExtent l="0" t="0" r="0" b="0"/>
-            <wp:docPr id="1" name="Picture 1"/>
-            <wp:cNvGraphicFramePr>
-              <a:graphicFrameLocks xmlns:a="http://schemas.openxmlformats.org/drawingml/2006/main" noChangeAspect="1"/>
-            </wp:cNvGraphicFramePr>
-            <a:graphic xmlns:a="http://schemas.openxmlformats.org/drawingml/2006/main">
-              <a:graphicData uri="http://schemas.openxmlformats.org/drawingml/2006/picture">
-                <pic:pic xmlns:pic="http://schemas.openxmlformats.org/drawingml/2006/picture">
-                  <pic:nvPicPr>
-                    <pic:cNvPr id="0" name=""/>
-                    <pic:cNvPicPr>
-                      <a:picLocks noChangeAspect="1" noChangeArrowheads="1"/>
-                    </pic:cNvPicPr>
-                  </pic:nvPicPr>
-                  <pic:blipFill>
-                    <a:blip r:embed="rId5"/>
-                    <a:srcRect/>
-                    <a:stretch>
-                      <a:fillRect/>
-                    </a:stretch>
-                  </pic:blipFill>
-                  <pic:spPr bwMode="auto">
-                    <a:xfrm>
-                      <a:off x="0" y="0"/>
-                      <a:ext cx="4795157" cy="3562117"/>
-                    </a:xfrm>
-                    <a:prstGeom prst="rect">
-                      <a:avLst/>
-                    </a:prstGeom>
-                  </pic:spPr>
-                </pic:pic>
-              </a:graphicData>
-            </a:graphic>
-          </wp:inline>
-        </w:drawing>
-      </w:r>
-    </w:p>
-    <w:p/>
-    <w:p>
-      <w:pPr>
-        <w:pStyle w:val="Heading3"/>
-        <w:rPr>
-          <w:color w:val="000000" w:themeColor="text1"/>
+          <w:color w:val="auto"/>
           <w:sz w:val="26"/>
           <w:szCs w:val="26"/>
         </w:rPr>
-      </w:pPr>
-      <w:r>
-        <w:rPr>
-          <w:color w:val="000000" w:themeColor="text1"/>
+        <w:t>churn</w:t>
+      </w:r>
+      <w:proofErr w:type="spellEnd"/>
+      <w:r>
+        <w:rPr>
+          <w:color w:val="auto"/>
+          <w:sz w:val="26"/>
+          <w:szCs w:val="26"/>
+        </w:rPr>
+        <w:t xml:space="preserve"> (fenêtre d'entraînement)</w:t>
+      </w:r>
+    </w:p>
+    <w:p>
+      <w:pPr>
+        <w:rPr>
+          <w:sz w:val="24"/>
+          <w:szCs w:val="24"/>
+        </w:rPr>
+      </w:pPr>
+      <w:r>
+        <w:rPr>
+          <w:sz w:val="24"/>
+          <w:szCs w:val="24"/>
+        </w:rPr>
+        <w:t>Sur les 709 clients actifs avant la coupure, 338 (47,7%) n'ont plus acheté sur les 3 mois suivants, contre 371 (52,3%) restés actifs — deux classes équilibrées, sans besoin de rééquilibrage artificiel.</w:t>
+      </w:r>
+    </w:p>
+    <w:p/>
+    <w:p>
+      <w:pPr>
+        <w:pStyle w:val="Heading3"/>
+        <w:rPr>
+          <w:color w:val="auto"/>
+          <w:sz w:val="26"/>
+          <w:szCs w:val="26"/>
+        </w:rPr>
+      </w:pPr>
+      <w:r>
+        <w:rPr>
+          <w:color w:val="auto"/>
           <w:sz w:val="26"/>
           <w:szCs w:val="26"/>
         </w:rPr>
@@ -698,7 +650,6 @@
               <w:rPr>
                 <w:b/>
                 <w:bCs/>
-                <w:color w:val="FFFFFF"/>
                 <w:sz w:val="24"/>
                 <w:szCs w:val="24"/>
               </w:rPr>
@@ -723,7 +674,6 @@
               <w:rPr>
                 <w:b/>
                 <w:bCs/>
-                <w:color w:val="FFFFFF"/>
                 <w:sz w:val="24"/>
                 <w:szCs w:val="24"/>
               </w:rPr>
@@ -748,7 +698,6 @@
               <w:rPr>
                 <w:b/>
                 <w:bCs/>
-                <w:color w:val="FFFFFF"/>
                 <w:sz w:val="24"/>
                 <w:szCs w:val="24"/>
               </w:rPr>
@@ -772,7 +721,6 @@
               <w:rPr>
                 <w:b/>
                 <w:bCs/>
-                <w:color w:val="FFFFFF"/>
                 <w:sz w:val="24"/>
                 <w:szCs w:val="24"/>
               </w:rPr>
@@ -801,7 +749,6 @@
             </w:pPr>
             <w:r>
               <w:rPr>
-                <w:color w:val="000000"/>
                 <w:sz w:val="24"/>
                 <w:szCs w:val="24"/>
               </w:rPr>
@@ -822,11 +769,10 @@
             </w:pPr>
             <w:r>
               <w:rPr>
-                <w:color w:val="000000"/>
-                <w:sz w:val="24"/>
-                <w:szCs w:val="24"/>
-              </w:rPr>
-              <w:t>0.955</w:t>
+                <w:sz w:val="24"/>
+                <w:szCs w:val="24"/>
+              </w:rPr>
+              <w:t>0.728</w:t>
             </w:r>
           </w:p>
         </w:tc>
@@ -843,11 +789,10 @@
             </w:pPr>
             <w:r>
               <w:rPr>
-                <w:color w:val="000000"/>
-                <w:sz w:val="24"/>
-                <w:szCs w:val="24"/>
-              </w:rPr>
-              <w:t>0.954</w:t>
+                <w:sz w:val="24"/>
+                <w:szCs w:val="24"/>
+              </w:rPr>
+              <w:t>0.674</w:t>
             </w:r>
           </w:p>
         </w:tc>
@@ -864,11 +809,10 @@
             </w:pPr>
             <w:r>
               <w:rPr>
-                <w:color w:val="000000"/>
-                <w:sz w:val="24"/>
-                <w:szCs w:val="24"/>
-              </w:rPr>
-              <w:t>0.956</w:t>
+                <w:sz w:val="24"/>
+                <w:szCs w:val="24"/>
+              </w:rPr>
+              <w:t>0.722</w:t>
             </w:r>
           </w:p>
         </w:tc>
@@ -893,11 +837,10 @@
             </w:pPr>
             <w:r>
               <w:rPr>
-                <w:color w:val="000000"/>
-                <w:sz w:val="24"/>
-                <w:szCs w:val="24"/>
-              </w:rPr>
-              <w:t>Random Forest (retenu)</w:t>
+                <w:sz w:val="24"/>
+                <w:szCs w:val="24"/>
+              </w:rPr>
+              <w:t>Random Forest</w:t>
             </w:r>
           </w:p>
         </w:tc>
@@ -914,11 +857,10 @@
             </w:pPr>
             <w:r>
               <w:rPr>
-                <w:color w:val="000000"/>
-                <w:sz w:val="24"/>
-                <w:szCs w:val="24"/>
-              </w:rPr>
-              <w:t>1.000</w:t>
+                <w:sz w:val="24"/>
+                <w:szCs w:val="24"/>
+              </w:rPr>
+              <w:t>0.746</w:t>
             </w:r>
           </w:p>
         </w:tc>
@@ -935,11 +877,10 @@
             </w:pPr>
             <w:r>
               <w:rPr>
-                <w:color w:val="000000"/>
-                <w:sz w:val="24"/>
-                <w:szCs w:val="24"/>
-              </w:rPr>
-              <w:t>1.000</w:t>
+                <w:sz w:val="24"/>
+                <w:szCs w:val="24"/>
+              </w:rPr>
+              <w:t>0.707</w:t>
             </w:r>
           </w:p>
         </w:tc>
@@ -956,11 +897,10 @@
             </w:pPr>
             <w:r>
               <w:rPr>
-                <w:color w:val="000000"/>
-                <w:sz w:val="24"/>
-                <w:szCs w:val="24"/>
-              </w:rPr>
-              <w:t>1.000</w:t>
+                <w:sz w:val="24"/>
+                <w:szCs w:val="24"/>
+              </w:rPr>
+              <w:t>0.742</w:t>
             </w:r>
           </w:p>
         </w:tc>
@@ -986,33 +926,18 @@
             <w:proofErr w:type="spellStart"/>
             <w:r>
               <w:rPr>
-                <w:color w:val="000000"/>
                 <w:sz w:val="24"/>
                 <w:szCs w:val="24"/>
               </w:rPr>
               <w:t>XGBoost</w:t>
             </w:r>
             <w:proofErr w:type="spellEnd"/>
-          </w:p>
-        </w:tc>
-        <w:tc>
-          <w:tcPr>
-            <w:tcW w:w="2000" w:type="dxa"/>
-          </w:tcPr>
-          <w:p>
-            <w:pPr>
-              <w:rPr>
-                <w:sz w:val="24"/>
-                <w:szCs w:val="24"/>
-              </w:rPr>
-            </w:pPr>
             <w:r>
               <w:rPr>
-                <w:color w:val="000000"/>
-                <w:sz w:val="24"/>
-                <w:szCs w:val="24"/>
-              </w:rPr>
-              <w:t>1.000</w:t>
+                <w:sz w:val="24"/>
+                <w:szCs w:val="24"/>
+              </w:rPr>
+              <w:t xml:space="preserve"> (retenu)</w:t>
             </w:r>
           </w:p>
         </w:tc>
@@ -1029,11 +954,10 @@
             </w:pPr>
             <w:r>
               <w:rPr>
-                <w:color w:val="000000"/>
-                <w:sz w:val="24"/>
-                <w:szCs w:val="24"/>
-              </w:rPr>
-              <w:t>1.000</w:t>
+                <w:sz w:val="24"/>
+                <w:szCs w:val="24"/>
+              </w:rPr>
+              <w:t>0.732</w:t>
             </w:r>
           </w:p>
         </w:tc>
@@ -1050,11 +974,30 @@
             </w:pPr>
             <w:r>
               <w:rPr>
-                <w:color w:val="000000"/>
-                <w:sz w:val="24"/>
-                <w:szCs w:val="24"/>
-              </w:rPr>
-              <w:t>1.000</w:t>
+                <w:sz w:val="24"/>
+                <w:szCs w:val="24"/>
+              </w:rPr>
+              <w:t>0.708</w:t>
+            </w:r>
+          </w:p>
+        </w:tc>
+        <w:tc>
+          <w:tcPr>
+            <w:tcW w:w="2000" w:type="dxa"/>
+          </w:tcPr>
+          <w:p>
+            <w:pPr>
+              <w:rPr>
+                <w:sz w:val="24"/>
+                <w:szCs w:val="24"/>
+              </w:rPr>
+            </w:pPr>
+            <w:r>
+              <w:rPr>
+                <w:sz w:val="24"/>
+                <w:szCs w:val="24"/>
+              </w:rPr>
+              <w:t>0.730</w:t>
             </w:r>
           </w:p>
         </w:tc>
@@ -1067,10 +1010,98 @@
           <w:noProof/>
         </w:rPr>
         <w:drawing>
-          <wp:inline distT="0" distB="0" distL="0" distR="0" wp14:anchorId="0B80A725" wp14:editId="600B2792">
-            <wp:extent cx="4819650" cy="3424488"/>
-            <wp:effectExtent l="0" t="0" r="0" b="5080"/>
-            <wp:docPr id="981523966" name="Picture 981523966"/>
+          <wp:inline distT="0" distB="0" distL="0" distR="0" wp14:anchorId="751B0A9E" wp14:editId="73ACA6DC">
+            <wp:extent cx="4686300" cy="3329740"/>
+            <wp:effectExtent l="0" t="0" r="0" b="4445"/>
+            <wp:docPr id="1" name="Picture 1"/>
+            <wp:cNvGraphicFramePr>
+              <a:graphicFrameLocks xmlns:a="http://schemas.openxmlformats.org/drawingml/2006/main" noChangeAspect="1"/>
+            </wp:cNvGraphicFramePr>
+            <a:graphic xmlns:a="http://schemas.openxmlformats.org/drawingml/2006/main">
+              <a:graphicData uri="http://schemas.openxmlformats.org/drawingml/2006/picture">
+                <pic:pic xmlns:pic="http://schemas.openxmlformats.org/drawingml/2006/picture">
+                  <pic:nvPicPr>
+                    <pic:cNvPr id="0" name=""/>
+                    <pic:cNvPicPr>
+                      <a:picLocks noChangeAspect="1" noChangeArrowheads="1"/>
+                    </pic:cNvPicPr>
+                  </pic:nvPicPr>
+                  <pic:blipFill>
+                    <a:blip r:embed="rId5"/>
+                    <a:srcRect/>
+                    <a:stretch>
+                      <a:fillRect/>
+                    </a:stretch>
+                  </pic:blipFill>
+                  <pic:spPr bwMode="auto">
+                    <a:xfrm>
+                      <a:off x="0" y="0"/>
+                      <a:ext cx="4701812" cy="3340761"/>
+                    </a:xfrm>
+                    <a:prstGeom prst="rect">
+                      <a:avLst/>
+                    </a:prstGeom>
+                  </pic:spPr>
+                </pic:pic>
+              </a:graphicData>
+            </a:graphic>
+          </wp:inline>
+        </w:drawing>
+      </w:r>
+    </w:p>
+    <w:p>
+      <w:pPr>
+        <w:rPr>
+          <w:sz w:val="24"/>
+          <w:szCs w:val="24"/>
+        </w:rPr>
+      </w:pPr>
+      <w:proofErr w:type="spellStart"/>
+      <w:r>
+        <w:rPr>
+          <w:sz w:val="24"/>
+          <w:szCs w:val="24"/>
+        </w:rPr>
+        <w:t>XGBoost</w:t>
+      </w:r>
+      <w:proofErr w:type="spellEnd"/>
+      <w:r>
+        <w:rPr>
+          <w:sz w:val="24"/>
+          <w:szCs w:val="24"/>
+        </w:rPr>
+        <w:t xml:space="preserve"> est retenu (meilleur F1-score, à égalité quasi parfaite avec Random Forest). Des scores autour de 73-75% sont cohérents avec un vrai problème de prédiction — ni suspects (100%), ni inexploitables (proches de 50%, le hasard).</w:t>
+      </w:r>
+    </w:p>
+    <w:p/>
+    <w:p>
+      <w:pPr>
+        <w:pStyle w:val="Heading3"/>
+        <w:rPr>
+          <w:color w:val="auto"/>
+          <w:sz w:val="26"/>
+          <w:szCs w:val="26"/>
+        </w:rPr>
+      </w:pPr>
+      <w:r>
+        <w:rPr>
+          <w:color w:val="auto"/>
+          <w:sz w:val="26"/>
+          <w:szCs w:val="26"/>
+        </w:rPr>
+        <w:t>4.3 Importance des variables</w:t>
+      </w:r>
+    </w:p>
+    <w:p>
+      <w:r>
+        <w:rPr>
+          <w:noProof/>
+        </w:rPr>
+        <w:drawing>
+          <wp:inline distT="0" distB="0" distL="0" distR="0" wp14:anchorId="4565F3DA" wp14:editId="09C9313C">
+            <wp:extent cx="4810125" cy="3417720"/>
+            <wp:effectExtent l="0" t="0" r="0" b="0"/>
+            <wp:docPr id="478865873" name="Picture 478865873"/>
             <wp:cNvGraphicFramePr>
               <a:graphicFrameLocks xmlns:a="http://schemas.openxmlformats.org/drawingml/2006/main" noChangeAspect="1"/>
             </wp:cNvGraphicFramePr>
@@ -1093,7 +1124,7 @@
                   <pic:spPr bwMode="auto">
                     <a:xfrm>
                       <a:off x="0" y="0"/>
-                      <a:ext cx="4827674" cy="3430189"/>
+                      <a:ext cx="4825582" cy="3428702"/>
                     </a:xfrm>
                     <a:prstGeom prst="rect">
                       <a:avLst/>
@@ -1118,7 +1149,8 @@
           <w:sz w:val="24"/>
           <w:szCs w:val="24"/>
         </w:rPr>
-        <w:t>L'importance des variables confirme que la Récence domine la décision du modèle (84%), suivie du nombre d'achats (9%) et du montant total (6%). L'âge n'a quasiment aucun poids.</w:t>
+        <w:lastRenderedPageBreak/>
+        <w:t>La Récence reste la variable la plus influente (36%), mais son poids est désormais partagé avec la part des achats en ligne (18%), le montant total (17%), la fréquence d'achats (15%) et l'âge (14%) — un profil de variables beaucoup plus équilibré et interprétable que dans la version précédente.</w:t>
       </w:r>
     </w:p>
     <w:p/>
@@ -1126,19 +1158,67 @@
       <w:pPr>
         <w:pStyle w:val="Heading3"/>
         <w:rPr>
-          <w:color w:val="000000" w:themeColor="text1"/>
+          <w:color w:val="auto"/>
           <w:sz w:val="26"/>
           <w:szCs w:val="26"/>
         </w:rPr>
       </w:pPr>
       <w:r>
         <w:rPr>
-          <w:color w:val="000000" w:themeColor="text1"/>
+          <w:color w:val="auto"/>
           <w:sz w:val="26"/>
           <w:szCs w:val="26"/>
         </w:rPr>
-        <w:lastRenderedPageBreak/>
-        <w:t>4.3 Valeur client par statut</w:t>
+        <w:t xml:space="preserve">4.4 Risque de </w:t>
+      </w:r>
+      <w:proofErr w:type="spellStart"/>
+      <w:r>
+        <w:rPr>
+          <w:color w:val="auto"/>
+          <w:sz w:val="26"/>
+          <w:szCs w:val="26"/>
+        </w:rPr>
+        <w:t>churn</w:t>
+      </w:r>
+      <w:proofErr w:type="spellEnd"/>
+      <w:r>
+        <w:rPr>
+          <w:color w:val="auto"/>
+          <w:sz w:val="26"/>
+          <w:szCs w:val="26"/>
+        </w:rPr>
+        <w:t xml:space="preserve"> actuel et valeur client</w:t>
+      </w:r>
+    </w:p>
+    <w:p>
+      <w:pPr>
+        <w:rPr>
+          <w:sz w:val="24"/>
+          <w:szCs w:val="24"/>
+        </w:rPr>
+      </w:pPr>
+      <w:r>
+        <w:rPr>
+          <w:sz w:val="24"/>
+          <w:szCs w:val="24"/>
+        </w:rPr>
+        <w:t xml:space="preserve">En appliquant le modèle retenu à l'historique complet (jusqu'au 31 décembre 2024), sur les 726 clients ayant un historique d'achat : 47,1% sont actuellement classés à risque de </w:t>
+      </w:r>
+      <w:proofErr w:type="spellStart"/>
+      <w:r>
+        <w:rPr>
+          <w:sz w:val="24"/>
+          <w:szCs w:val="24"/>
+        </w:rPr>
+        <w:t>churn</w:t>
+      </w:r>
+      <w:proofErr w:type="spellEnd"/>
+      <w:r>
+        <w:rPr>
+          <w:sz w:val="24"/>
+          <w:szCs w:val="24"/>
+        </w:rPr>
+        <w:t>.</w:t>
       </w:r>
     </w:p>
     <w:p>
@@ -1147,10 +1227,10 @@
           <w:noProof/>
         </w:rPr>
         <w:drawing>
-          <wp:inline distT="0" distB="0" distL="0" distR="0" wp14:anchorId="403EE5F8" wp14:editId="47E5B27A">
-            <wp:extent cx="4923693" cy="3657600"/>
-            <wp:effectExtent l="0" t="0" r="0" b="0"/>
-            <wp:docPr id="1527292502" name="Picture 1527292502"/>
+          <wp:inline distT="0" distB="0" distL="0" distR="0" wp14:anchorId="4938B8EB" wp14:editId="11D574CD">
+            <wp:extent cx="4943475" cy="3672296"/>
+            <wp:effectExtent l="0" t="0" r="0" b="4445"/>
+            <wp:docPr id="989170265" name="Picture 989170265"/>
             <wp:cNvGraphicFramePr>
               <a:graphicFrameLocks xmlns:a="http://schemas.openxmlformats.org/drawingml/2006/main" noChangeAspect="1"/>
             </wp:cNvGraphicFramePr>
@@ -1173,7 +1253,7 @@
                   <pic:spPr bwMode="auto">
                     <a:xfrm>
                       <a:off x="0" y="0"/>
-                      <a:ext cx="4933431" cy="3664834"/>
+                      <a:ext cx="4964261" cy="3687737"/>
                     </a:xfrm>
                     <a:prstGeom prst="rect">
                       <a:avLst/>
@@ -1186,43 +1266,74 @@
         </w:drawing>
       </w:r>
     </w:p>
-    <w:p>
-      <w:pPr>
-        <w:rPr>
-          <w:sz w:val="24"/>
-          <w:szCs w:val="24"/>
-        </w:rPr>
-      </w:pPr>
-      <w:r>
-        <w:rPr>
-          <w:sz w:val="24"/>
-          <w:szCs w:val="24"/>
-        </w:rPr>
-        <w:t xml:space="preserve">La CLV moyenne des clients actifs (903,65) est près de trois fois supérieure à celle des clients </w:t>
-      </w:r>
-      <w:proofErr w:type="spellStart"/>
-      <w:r>
-        <w:rPr>
-          <w:sz w:val="24"/>
-          <w:szCs w:val="24"/>
-        </w:rPr>
-        <w:t>churnés</w:t>
-      </w:r>
-      <w:proofErr w:type="spellEnd"/>
-      <w:r>
-        <w:rPr>
-          <w:sz w:val="24"/>
-          <w:szCs w:val="24"/>
-        </w:rPr>
-        <w:t xml:space="preserve"> (320,78). Ce résultat renforce la priorité identifiée pour la stratégie (M7) : concentrer les actions de fidélisation sur les clients à forte valeur montrant des signes de désengagement, plutôt que sur l'ensemble de la base.</w:t>
-      </w:r>
-    </w:p>
     <w:p/>
     <w:p>
+      <w:r>
+        <w:rPr>
+          <w:noProof/>
+        </w:rPr>
+        <w:drawing>
+          <wp:inline distT="0" distB="0" distL="0" distR="0" wp14:anchorId="42FE9376" wp14:editId="5B1AAA9B">
+            <wp:extent cx="4886325" cy="3629841"/>
+            <wp:effectExtent l="0" t="0" r="0" b="8890"/>
+            <wp:docPr id="1509173255" name="Picture 1509173255"/>
+            <wp:cNvGraphicFramePr>
+              <a:graphicFrameLocks xmlns:a="http://schemas.openxmlformats.org/drawingml/2006/main" noChangeAspect="1"/>
+            </wp:cNvGraphicFramePr>
+            <a:graphic xmlns:a="http://schemas.openxmlformats.org/drawingml/2006/main">
+              <a:graphicData uri="http://schemas.openxmlformats.org/drawingml/2006/picture">
+                <pic:pic xmlns:pic="http://schemas.openxmlformats.org/drawingml/2006/picture">
+                  <pic:nvPicPr>
+                    <pic:cNvPr id="0" name=""/>
+                    <pic:cNvPicPr>
+                      <a:picLocks noChangeAspect="1" noChangeArrowheads="1"/>
+                    </pic:cNvPicPr>
+                  </pic:nvPicPr>
+                  <pic:blipFill>
+                    <a:blip r:embed="rId8"/>
+                    <a:srcRect/>
+                    <a:stretch>
+                      <a:fillRect/>
+                    </a:stretch>
+                  </pic:blipFill>
+                  <pic:spPr bwMode="auto">
+                    <a:xfrm>
+                      <a:off x="0" y="0"/>
+                      <a:ext cx="4893549" cy="3635207"/>
+                    </a:xfrm>
+                    <a:prstGeom prst="rect">
+                      <a:avLst/>
+                    </a:prstGeom>
+                  </pic:spPr>
+                </pic:pic>
+              </a:graphicData>
+            </a:graphic>
+          </wp:inline>
+        </w:drawing>
+      </w:r>
+    </w:p>
+    <w:p>
+      <w:pPr>
+        <w:rPr>
+          <w:sz w:val="24"/>
+          <w:szCs w:val="24"/>
+        </w:rPr>
+      </w:pPr>
+      <w:r>
+        <w:rPr>
+          <w:sz w:val="24"/>
+          <w:szCs w:val="24"/>
+        </w:rPr>
+        <w:lastRenderedPageBreak/>
+        <w:t>La CLV moyenne des clients non à risque (907) est plus de 2 fois supérieure à celle des clients à risque (400) — un signal cohérent avec l'analyse précédente, qui confirme la priorité pour la stratégie (M7) : concentrer les actions de fidélisation sur les clients à forte valeur qui montrent des signes de désengagement.</w:t>
+      </w:r>
+    </w:p>
+    <w:p/>
+    <w:p>
       <w:pPr>
         <w:pStyle w:val="Heading2"/>
         <w:rPr>
-          <w:color w:val="000000" w:themeColor="text1"/>
+          <w:color w:val="auto"/>
           <w:sz w:val="28"/>
           <w:szCs w:val="28"/>
           <w:u w:val="single"/>
@@ -1230,90 +1341,42 @@
       </w:pPr>
       <w:r>
         <w:rPr>
-          <w:color w:val="000000" w:themeColor="text1"/>
+          <w:color w:val="auto"/>
           <w:sz w:val="28"/>
           <w:szCs w:val="28"/>
           <w:u w:val="single"/>
         </w:rPr>
-        <w:t>5. Limites et points de vigilance</w:t>
-      </w:r>
-    </w:p>
-    <w:p>
-      <w:pPr>
-        <w:rPr>
-          <w:sz w:val="24"/>
-          <w:szCs w:val="24"/>
-        </w:rPr>
-      </w:pPr>
-      <w:r>
-        <w:rPr>
-          <w:sz w:val="24"/>
-          <w:szCs w:val="24"/>
-        </w:rPr>
-        <w:t xml:space="preserve">Circularité de l'évaluation : la Récence définit à la fois la règle de </w:t>
-      </w:r>
-      <w:proofErr w:type="spellStart"/>
-      <w:r>
-        <w:rPr>
-          <w:sz w:val="24"/>
-          <w:szCs w:val="24"/>
-        </w:rPr>
-        <w:t>churn</w:t>
-      </w:r>
-      <w:proofErr w:type="spellEnd"/>
-      <w:r>
-        <w:rPr>
-          <w:sz w:val="24"/>
-          <w:szCs w:val="24"/>
-        </w:rPr>
-        <w:t xml:space="preserve"> et sert de variable prédictive principale. Les scores proches de 100% (Random Forest, </w:t>
-      </w:r>
-      <w:proofErr w:type="spellStart"/>
-      <w:r>
-        <w:rPr>
-          <w:sz w:val="24"/>
-          <w:szCs w:val="24"/>
-        </w:rPr>
-        <w:t>XGBoost</w:t>
-      </w:r>
-      <w:proofErr w:type="spellEnd"/>
-      <w:r>
-        <w:rPr>
-          <w:sz w:val="24"/>
-          <w:szCs w:val="24"/>
-        </w:rPr>
-        <w:t xml:space="preserve">) traduisent la cohérence interne de la règle plutôt qu'une capacité de prédiction sur des clients dont l'issue est réellement incertaine. En conditions réelles, un modèle de </w:t>
-      </w:r>
-      <w:proofErr w:type="spellStart"/>
-      <w:r>
-        <w:rPr>
-          <w:sz w:val="24"/>
-          <w:szCs w:val="24"/>
-        </w:rPr>
-        <w:t>churn</w:t>
-      </w:r>
-      <w:proofErr w:type="spellEnd"/>
-      <w:r>
-        <w:rPr>
-          <w:sz w:val="24"/>
-          <w:szCs w:val="24"/>
-        </w:rPr>
-        <w:t xml:space="preserve"> viserait à anticiper le départ avant qu'il ne soit déjà consommé par 90 jours d'inactivité, à partir de signaux plus précoces (baisse de fréquence, panier en diminution, etc.).</w:t>
-      </w:r>
-    </w:p>
-    <w:p>
-      <w:pPr>
-        <w:rPr>
-          <w:sz w:val="24"/>
-          <w:szCs w:val="24"/>
-        </w:rPr>
-      </w:pPr>
-      <w:r>
-        <w:rPr>
-          <w:sz w:val="24"/>
-          <w:szCs w:val="24"/>
-        </w:rPr>
-        <w:t>Données synthétiques : conformément à docs/regles_donnees.md, le jeu de 805 clients est généré selon des profils de comportement simulés. Les conclusions sont valables sous ces hypothèses de génération, et démontrent la méthode plutôt qu'un comportement client réel.</w:t>
+        <w:t>5. Limites</w:t>
+      </w:r>
+    </w:p>
+    <w:p>
+      <w:pPr>
+        <w:rPr>
+          <w:sz w:val="24"/>
+          <w:szCs w:val="24"/>
+        </w:rPr>
+      </w:pPr>
+      <w:r>
+        <w:rPr>
+          <w:sz w:val="24"/>
+          <w:szCs w:val="24"/>
+        </w:rPr>
+        <w:t>Données synthétiques : conformément à docs/regles_donnees.md, les 805 clients sont générés selon des profils de comportement simulés. Les conclusions sont valables sous ces hypothèses de génération.</w:t>
+      </w:r>
+    </w:p>
+    <w:p>
+      <w:pPr>
+        <w:rPr>
+          <w:sz w:val="24"/>
+          <w:szCs w:val="24"/>
+        </w:rPr>
+      </w:pPr>
+      <w:r>
+        <w:rPr>
+          <w:sz w:val="24"/>
+          <w:szCs w:val="24"/>
+        </w:rPr>
+        <w:t>Le seuil de coupure (30/09/2024) et la fenêtre d'observation future (3 mois) sont des choix méthodologiques ; un seuil différent donnerait une répartition de classes et des scores légèrement différents.</w:t>
       </w:r>
     </w:p>
     <w:p/>
@@ -1321,7 +1384,7 @@
       <w:pPr>
         <w:pStyle w:val="Heading2"/>
         <w:rPr>
-          <w:color w:val="000000" w:themeColor="text1"/>
+          <w:color w:val="auto"/>
           <w:sz w:val="28"/>
           <w:szCs w:val="28"/>
           <w:u w:val="single"/>
@@ -1329,7 +1392,7 @@
       </w:pPr>
       <w:r>
         <w:rPr>
-          <w:color w:val="000000" w:themeColor="text1"/>
+          <w:color w:val="auto"/>
           <w:sz w:val="28"/>
           <w:szCs w:val="28"/>
           <w:u w:val="single"/>
@@ -1429,7 +1492,7 @@
           <w:sz w:val="24"/>
           <w:szCs w:val="24"/>
         </w:rPr>
-        <w:t xml:space="preserve">) transmis à </w:t>
+        <w:t xml:space="preserve">), pour 726 clients ayant un historique d'achat, transmis à </w:t>
       </w:r>
       <w:proofErr w:type="spellStart"/>
       <w:r>
@@ -1445,7 +1508,7 @@
           <w:sz w:val="24"/>
           <w:szCs w:val="24"/>
         </w:rPr>
-        <w:t xml:space="preserve"> pour le </w:t>
+        <w:t xml:space="preserve"> (M8). Conclusions transmises à Lalatiana (M7) : prioriser la fidélisation des clients à forte CLV présentant une probabilité de </w:t>
       </w:r>
       <w:proofErr w:type="spellStart"/>
       <w:r>
@@ -1453,7 +1516,7 @@
           <w:sz w:val="24"/>
           <w:szCs w:val="24"/>
         </w:rPr>
-        <w:t>dashboard</w:t>
+        <w:t>churn</w:t>
       </w:r>
       <w:proofErr w:type="spellEnd"/>
       <w:r>
@@ -1461,7 +1524,7 @@
           <w:sz w:val="24"/>
           <w:szCs w:val="24"/>
         </w:rPr>
-        <w:t xml:space="preserve"> (M8). Conclusions transmises à Lalatiana pour la stratégie (M7) : prioriser la fidélisation des clients à forte CLV présentant une récence en hausse.</w:t>
+        <w:t xml:space="preserve"> élevée, cibler en particulier les canaux et montants d'achat identifiés comme signaux précoces.</w:t>
       </w:r>
     </w:p>
     <w:sectPr>
@@ -1477,10 +1540,10 @@
 <file path=word/numbering.xml><?xml version="1.0" encoding="utf-8"?>
 <w:numbering xmlns:wpc="http://schemas.microsoft.com/office/word/2010/wordprocessingCanvas" xmlns:cx="http://schemas.microsoft.com/office/drawing/2014/chartex" xmlns:cx1="http://schemas.microsoft.com/office/drawing/2015/9/8/chartex" xmlns:cx2="http://schemas.microsoft.com/office/drawing/2015/10/21/chartex" xmlns:cx3="http://schemas.microsoft.com/office/drawing/2016/5/9/chartex" xmlns:cx4="http://schemas.microsoft.com/office/drawing/2016/5/10/chartex" xmlns:cx5="http://schemas.microsoft.com/office/drawing/2016/5/11/chartex" xmlns:cx6="http://schemas.microsoft.com/office/drawing/2016/5/12/chartex" xmlns:cx7="http://schemas.microsoft.com/office/drawing/2016/5/13/chartex" xmlns:cx8="http://schemas.microsoft.com/office/drawing/2016/5/14/chartex" xmlns:mc="http://schemas.openxmlformats.org/markup-compatibility/2006" xmlns:aink="http://schemas.microsoft.com/office/drawing/2016/ink" xmlns:am3d="http://schemas.microsoft.com/office/drawing/2017/model3d" xmlns:o="urn:schemas-microsoft-com:office:office" xmlns:oel="http://schemas.microsoft.com/office/2019/extlst" xmlns:r="http://schemas.openxmlformats.org/officeDocument/2006/relationships" xmlns:m="http://schemas.openxmlformats.org/officeDocument/2006/math" xmlns:v="urn:schemas-microsoft-com:vml" xmlns:wp14="http://schemas.microsoft.com/office/word/2010/wordprocessingDrawing" xmlns:wp="http://schemas.openxmlformats.org/drawingml/2006/wordprocessingDrawing" xmlns:w10="urn:schemas-microsoft-com:office:word" xmlns:w="http://schemas.openxmlformats.org/wordprocessingml/2006/main" xmlns:w14="http://schemas.microsoft.com/office/word/2010/wordml" xmlns:w15="http://schemas.microsoft.com/office/word/2012/wordml" xmlns:w16cex="http://schemas.microsoft.com/office/word/2018/wordml/cex" xmlns:w16cid="http://schemas.microsoft.com/office/word/2016/wordml/cid" xmlns:w16="http://schemas.microsoft.com/office/word/2018/wordml" xmlns:w16du="http://schemas.microsoft.com/office/word/2023/wordml/word16du" xmlns:w16sdtdh="http://schemas.microsoft.com/office/word/2020/wordml/sdtdatahash" xmlns:w16sdtfl="http://schemas.microsoft.com/office/word/2024/wordml/sdtformatlock" xmlns:w16se="http://schemas.microsoft.com/office/word/2015/wordml/symex" xmlns:wpg="http://schemas.microsoft.com/office/word/2010/wordprocessingGroup" xmlns:wpi="http://schemas.microsoft.com/office/word/2010/wordprocessingInk" xmlns:wne="http://schemas.microsoft.com/office/word/2006/wordml" xmlns:wps="http://schemas.microsoft.com/office/word/2010/wordprocessingShape" mc:Ignorable="w14 w15 w16se w16cid w16 w16cex w16sdtdh w16sdtfl w16du wp14">
   <w:abstractNum w:abstractNumId="0" w15:restartNumberingAfterBreak="0">
-    <w:nsid w:val="0DB33032"/>
+    <w:nsid w:val="7AA142E3"/>
     <w:multiLevelType w:val="hybridMultilevel"/>
-    <w:tmpl w:val="83EA4384"/>
-    <w:lvl w:ilvl="0" w:tplc="813413BA">
+    <w:tmpl w:val="CD942D0A"/>
+    <w:lvl w:ilvl="0" w:tplc="5FDC10D6">
       <w:start w:val="1"/>
       <w:numFmt w:val="bullet"/>
       <w:lvlText w:val="●"/>
@@ -1489,7 +1552,7 @@
         <w:ind w:left="720" w:hanging="360"/>
       </w:pPr>
     </w:lvl>
-    <w:lvl w:ilvl="1" w:tplc="43FA4620">
+    <w:lvl w:ilvl="1" w:tplc="3C10935E">
       <w:start w:val="1"/>
       <w:numFmt w:val="bullet"/>
       <w:lvlText w:val="○"/>
@@ -1498,7 +1561,7 @@
         <w:ind w:left="1440" w:hanging="360"/>
       </w:pPr>
     </w:lvl>
-    <w:lvl w:ilvl="2" w:tplc="B01CAB22">
+    <w:lvl w:ilvl="2" w:tplc="20441DC8">
       <w:start w:val="1"/>
       <w:numFmt w:val="bullet"/>
       <w:lvlText w:val="■"/>
@@ -1507,7 +1570,7 @@
         <w:ind w:left="2160" w:hanging="360"/>
       </w:pPr>
     </w:lvl>
-    <w:lvl w:ilvl="3" w:tplc="DC6A4E48">
+    <w:lvl w:ilvl="3" w:tplc="F5AEDF56">
       <w:start w:val="1"/>
       <w:numFmt w:val="bullet"/>
       <w:lvlText w:val="●"/>
@@ -1516,7 +1579,7 @@
         <w:ind w:left="2880" w:hanging="360"/>
       </w:pPr>
     </w:lvl>
-    <w:lvl w:ilvl="4" w:tplc="A46EA38E">
+    <w:lvl w:ilvl="4" w:tplc="6AB653BE">
       <w:start w:val="1"/>
       <w:numFmt w:val="bullet"/>
       <w:lvlText w:val="○"/>
@@ -1525,7 +1588,7 @@
         <w:ind w:left="3600" w:hanging="360"/>
       </w:pPr>
     </w:lvl>
-    <w:lvl w:ilvl="5" w:tplc="10CA594A">
+    <w:lvl w:ilvl="5" w:tplc="0E24F4D6">
       <w:start w:val="1"/>
       <w:numFmt w:val="bullet"/>
       <w:lvlText w:val="■"/>
@@ -1534,7 +1597,7 @@
         <w:ind w:left="4320" w:hanging="360"/>
       </w:pPr>
     </w:lvl>
-    <w:lvl w:ilvl="6" w:tplc="05366572">
+    <w:lvl w:ilvl="6" w:tplc="51D4B0EE">
       <w:start w:val="1"/>
       <w:numFmt w:val="bullet"/>
       <w:lvlText w:val="●"/>
@@ -1543,7 +1606,7 @@
         <w:ind w:left="5040" w:hanging="360"/>
       </w:pPr>
     </w:lvl>
-    <w:lvl w:ilvl="7" w:tplc="2EC83EA0">
+    <w:lvl w:ilvl="7" w:tplc="2D28C770">
       <w:start w:val="1"/>
       <w:numFmt w:val="bullet"/>
       <w:lvlText w:val="●"/>
@@ -1552,7 +1615,7 @@
         <w:ind w:left="5760" w:hanging="360"/>
       </w:pPr>
     </w:lvl>
-    <w:lvl w:ilvl="8" w:tplc="F984E434">
+    <w:lvl w:ilvl="8" w:tplc="91FA87EA">
       <w:start w:val="1"/>
       <w:numFmt w:val="bullet"/>
       <w:lvlText w:val="●"/>
@@ -1562,7 +1625,7 @@
       </w:pPr>
     </w:lvl>
   </w:abstractNum>
-  <w:num w:numId="1" w16cid:durableId="2004047389">
+  <w:num w:numId="1" w16cid:durableId="1388258130">
     <w:abstractNumId w:val="0"/>
     <w:lvlOverride w:ilvl="0">
       <w:startOverride w:val="1"/>

</xml_diff>